<commit_message>
update on 2026-03-25 13:43:39.262450
</commit_message>
<xml_diff>
--- a/py - geometry.docx
+++ b/py - geometry.docx
@@ -2024,12 +2024,6 @@
             <w:insideH w:val="single" w:color="auto" w:sz="4" w:space="0"/>
             <w:insideV w:val="single" w:color="auto" w:sz="4" w:space="0"/>
           </w:tblBorders>
-          <w:tblCellMar>
-            <w:top w:w="0" w:type="dxa"/>
-            <w:left w:w="108" w:type="dxa"/>
-            <w:bottom w:w="0" w:type="dxa"/>
-            <w:right w:w="108" w:type="dxa"/>
-          </w:tblCellMar>
         </w:tblPrEx>
         <w:tc>
           <w:tcPr>
@@ -2903,6 +2897,12 @@
             <w:insideH w:val="single" w:color="auto" w:sz="4" w:space="0"/>
             <w:insideV w:val="single" w:color="auto" w:sz="4" w:space="0"/>
           </w:tblBorders>
+          <w:tblCellMar>
+            <w:top w:w="0" w:type="dxa"/>
+            <w:left w:w="108" w:type="dxa"/>
+            <w:bottom w:w="0" w:type="dxa"/>
+            <w:right w:w="108" w:type="dxa"/>
+          </w:tblCellMar>
         </w:tblPrEx>
         <w:trPr>
           <w:trHeight w:val="116" w:hRule="atLeast"/>
@@ -4131,12 +4131,6 @@
             <w:insideH w:val="single" w:color="auto" w:sz="4" w:space="0"/>
             <w:insideV w:val="single" w:color="auto" w:sz="4" w:space="0"/>
           </w:tblBorders>
-          <w:tblCellMar>
-            <w:top w:w="0" w:type="dxa"/>
-            <w:left w:w="108" w:type="dxa"/>
-            <w:bottom w:w="0" w:type="dxa"/>
-            <w:right w:w="108" w:type="dxa"/>
-          </w:tblCellMar>
         </w:tblPrEx>
         <w:tc>
           <w:tcPr>
@@ -4179,12 +4173,6 @@
             <w:insideH w:val="single" w:color="auto" w:sz="4" w:space="0"/>
             <w:insideV w:val="single" w:color="auto" w:sz="4" w:space="0"/>
           </w:tblBorders>
-          <w:tblCellMar>
-            <w:top w:w="0" w:type="dxa"/>
-            <w:left w:w="108" w:type="dxa"/>
-            <w:bottom w:w="0" w:type="dxa"/>
-            <w:right w:w="108" w:type="dxa"/>
-          </w:tblCellMar>
         </w:tblPrEx>
         <w:trPr>
           <w:trHeight w:val="90" w:hRule="atLeast"/>
@@ -4267,12 +4255,6 @@
             <w:insideH w:val="single" w:color="auto" w:sz="4" w:space="0"/>
             <w:insideV w:val="single" w:color="auto" w:sz="4" w:space="0"/>
           </w:tblBorders>
-          <w:tblCellMar>
-            <w:top w:w="0" w:type="dxa"/>
-            <w:left w:w="108" w:type="dxa"/>
-            <w:bottom w:w="0" w:type="dxa"/>
-            <w:right w:w="108" w:type="dxa"/>
-          </w:tblCellMar>
         </w:tblPrEx>
         <w:tc>
           <w:tcPr>
@@ -4386,12 +4368,6 @@
             <w:insideH w:val="single" w:color="auto" w:sz="4" w:space="0"/>
             <w:insideV w:val="single" w:color="auto" w:sz="4" w:space="0"/>
           </w:tblBorders>
-          <w:tblCellMar>
-            <w:top w:w="0" w:type="dxa"/>
-            <w:left w:w="108" w:type="dxa"/>
-            <w:bottom w:w="0" w:type="dxa"/>
-            <w:right w:w="108" w:type="dxa"/>
-          </w:tblCellMar>
         </w:tblPrEx>
         <w:tc>
           <w:tcPr>
@@ -4496,12 +4472,6 @@
             <w:insideH w:val="single" w:color="auto" w:sz="4" w:space="0"/>
             <w:insideV w:val="single" w:color="auto" w:sz="4" w:space="0"/>
           </w:tblBorders>
-          <w:tblCellMar>
-            <w:top w:w="0" w:type="dxa"/>
-            <w:left w:w="108" w:type="dxa"/>
-            <w:bottom w:w="0" w:type="dxa"/>
-            <w:right w:w="108" w:type="dxa"/>
-          </w:tblCellMar>
         </w:tblPrEx>
         <w:tc>
           <w:tcPr>
@@ -4590,12 +4560,6 @@
             <w:insideH w:val="single" w:color="auto" w:sz="4" w:space="0"/>
             <w:insideV w:val="single" w:color="auto" w:sz="4" w:space="0"/>
           </w:tblBorders>
-          <w:tblCellMar>
-            <w:top w:w="0" w:type="dxa"/>
-            <w:left w:w="108" w:type="dxa"/>
-            <w:bottom w:w="0" w:type="dxa"/>
-            <w:right w:w="108" w:type="dxa"/>
-          </w:tblCellMar>
         </w:tblPrEx>
         <w:trPr>
           <w:trHeight w:val="90" w:hRule="atLeast"/>
@@ -4733,12 +4697,6 @@
             <w:insideH w:val="single" w:color="auto" w:sz="4" w:space="0"/>
             <w:insideV w:val="single" w:color="auto" w:sz="4" w:space="0"/>
           </w:tblBorders>
-          <w:tblCellMar>
-            <w:top w:w="0" w:type="dxa"/>
-            <w:left w:w="108" w:type="dxa"/>
-            <w:bottom w:w="0" w:type="dxa"/>
-            <w:right w:w="108" w:type="dxa"/>
-          </w:tblCellMar>
         </w:tblPrEx>
         <w:tc>
           <w:tcPr>
@@ -5153,12 +5111,6 @@
             <w:insideH w:val="single" w:color="auto" w:sz="4" w:space="0"/>
             <w:insideV w:val="single" w:color="auto" w:sz="4" w:space="0"/>
           </w:tblBorders>
-          <w:tblCellMar>
-            <w:top w:w="0" w:type="dxa"/>
-            <w:left w:w="108" w:type="dxa"/>
-            <w:bottom w:w="0" w:type="dxa"/>
-            <w:right w:w="108" w:type="dxa"/>
-          </w:tblCellMar>
         </w:tblPrEx>
         <w:tc>
           <w:tcPr>
@@ -5235,12 +5187,6 @@
             <w:insideH w:val="single" w:color="auto" w:sz="4" w:space="0"/>
             <w:insideV w:val="single" w:color="auto" w:sz="4" w:space="0"/>
           </w:tblBorders>
-          <w:tblCellMar>
-            <w:top w:w="0" w:type="dxa"/>
-            <w:left w:w="108" w:type="dxa"/>
-            <w:bottom w:w="0" w:type="dxa"/>
-            <w:right w:w="108" w:type="dxa"/>
-          </w:tblCellMar>
         </w:tblPrEx>
         <w:tc>
           <w:tcPr>
@@ -5611,12 +5557,6 @@
             <w:insideH w:val="single" w:color="auto" w:sz="4" w:space="0"/>
             <w:insideV w:val="single" w:color="auto" w:sz="4" w:space="0"/>
           </w:tblBorders>
-          <w:tblCellMar>
-            <w:top w:w="0" w:type="dxa"/>
-            <w:left w:w="108" w:type="dxa"/>
-            <w:bottom w:w="0" w:type="dxa"/>
-            <w:right w:w="108" w:type="dxa"/>
-          </w:tblCellMar>
         </w:tblPrEx>
         <w:trPr>
           <w:trHeight w:val="90" w:hRule="atLeast"/>
@@ -5906,12 +5846,6 @@
             <w:insideH w:val="single" w:color="auto" w:sz="4" w:space="0"/>
             <w:insideV w:val="single" w:color="auto" w:sz="4" w:space="0"/>
           </w:tblBorders>
-          <w:tblCellMar>
-            <w:top w:w="0" w:type="dxa"/>
-            <w:left w:w="108" w:type="dxa"/>
-            <w:bottom w:w="0" w:type="dxa"/>
-            <w:right w:w="108" w:type="dxa"/>
-          </w:tblCellMar>
         </w:tblPrEx>
         <w:tc>
           <w:tcPr>
@@ -5976,12 +5910,6 @@
             <w:insideH w:val="single" w:color="auto" w:sz="4" w:space="0"/>
             <w:insideV w:val="single" w:color="auto" w:sz="4" w:space="0"/>
           </w:tblBorders>
-          <w:tblCellMar>
-            <w:top w:w="0" w:type="dxa"/>
-            <w:left w:w="108" w:type="dxa"/>
-            <w:bottom w:w="0" w:type="dxa"/>
-            <w:right w:w="108" w:type="dxa"/>
-          </w:tblCellMar>
         </w:tblPrEx>
         <w:tc>
           <w:tcPr>
@@ -6345,7 +6273,7 @@
                 <w:rFonts w:hint="eastAsia"/>
                 <w:lang w:val="en-US" w:eastAsia="zh-CN"/>
               </w:rPr>
-              <w:t>get_min_bound / get_max_bound() /</w:t>
+              <w:t>get_min_bound / get_max_bound /</w:t>
             </w:r>
           </w:p>
           <w:p>
@@ -6363,6 +6291,42 @@
                 <w:rFonts w:hint="eastAsia"/>
                 <w:lang w:val="en-US" w:eastAsia="zh-CN"/>
               </w:rPr>
+              <w:t xml:space="preserve">get_axis_aligned_bounding_box() / </w:t>
+            </w:r>
+          </w:p>
+          <w:p>
+            <w:pPr>
+              <w:pStyle w:val="13"/>
+              <w:bidi w:val="0"/>
+              <w:jc w:val="both"/>
+              <w:rPr>
+                <w:rFonts w:hint="default"/>
+                <w:lang w:val="en-US" w:eastAsia="zh-CN"/>
+              </w:rPr>
+            </w:pPr>
+            <w:r>
+              <w:rPr>
+                <w:rFonts w:hint="eastAsia"/>
+                <w:lang w:val="en-US" w:eastAsia="zh-CN"/>
+              </w:rPr>
+              <w:t>get_minimal_oriented_bounding_box /</w:t>
+            </w:r>
+          </w:p>
+          <w:p>
+            <w:pPr>
+              <w:pStyle w:val="13"/>
+              <w:bidi w:val="0"/>
+              <w:jc w:val="both"/>
+              <w:rPr>
+                <w:rFonts w:hint="default"/>
+                <w:lang w:val="en-US" w:eastAsia="zh-CN"/>
+              </w:rPr>
+            </w:pPr>
+            <w:r>
+              <w:rPr>
+                <w:rFonts w:hint="eastAsia"/>
+                <w:lang w:val="en-US" w:eastAsia="zh-CN"/>
+              </w:rPr>
               <w:t>get_oriented_bounding_box(self, robust=False)</w:t>
             </w:r>
           </w:p>
@@ -6395,6 +6359,118 @@
                 <w:lang w:val="en-US" w:eastAsia="zh-CN"/>
               </w:rPr>
               <w:t>边界框</w:t>
+            </w:r>
+          </w:p>
+        </w:tc>
+      </w:tr>
+      <w:tr>
+        <w:tblPrEx>
+          <w:tblBorders>
+            <w:top w:val="single" w:color="auto" w:sz="4" w:space="0"/>
+            <w:left w:val="single" w:color="auto" w:sz="4" w:space="0"/>
+            <w:bottom w:val="single" w:color="auto" w:sz="4" w:space="0"/>
+            <w:right w:val="single" w:color="auto" w:sz="4" w:space="0"/>
+            <w:insideH w:val="single" w:color="auto" w:sz="4" w:space="0"/>
+            <w:insideV w:val="single" w:color="auto" w:sz="4" w:space="0"/>
+          </w:tblBorders>
+        </w:tblPrEx>
+        <w:tc>
+          <w:tcPr>
+            <w:tcW w:w="0" w:type="auto"/>
+            <w:vMerge w:val="restart"/>
+            <w:vAlign w:val="center"/>
+          </w:tcPr>
+          <w:p>
+            <w:pPr>
+              <w:pStyle w:val="13"/>
+              <w:bidi w:val="0"/>
+              <w:jc w:val="both"/>
+              <w:rPr>
+                <w:rFonts w:hint="eastAsia" w:ascii="华文中宋" w:hAnsi="华文中宋" w:eastAsia="华文中宋" w:cs="华文中宋"/>
+                <w:b/>
+                <w:bCs/>
+                <w:color w:val="ED7D31"/>
+                <w:kern w:val="2"/>
+                <w:sz w:val="21"/>
+                <w:szCs w:val="21"/>
+                <w:lang w:val="en-US" w:eastAsia="zh-CN" w:bidi="ar-SA"/>
+              </w:rPr>
+            </w:pPr>
+            <w:r>
+              <w:rPr>
+                <w:rFonts w:hint="eastAsia" w:ascii="华文中宋" w:hAnsi="华文中宋" w:eastAsia="华文中宋" w:cs="华文中宋"/>
+                <w:b/>
+                <w:bCs/>
+                <w:color w:val="ED7D31"/>
+                <w:kern w:val="2"/>
+                <w:sz w:val="21"/>
+                <w:szCs w:val="21"/>
+                <w:lang w:val="en-US" w:eastAsia="zh-CN" w:bidi="ar-SA"/>
+              </w:rPr>
+              <w:t>实例</w:t>
+            </w:r>
+            <w:r>
+              <w:rPr>
+                <w:rFonts w:hint="eastAsia" w:cs="华文中宋"/>
+                <w:b/>
+                <w:bCs/>
+                <w:color w:val="ED7D31"/>
+                <w:kern w:val="2"/>
+                <w:sz w:val="21"/>
+                <w:szCs w:val="21"/>
+                <w:lang w:val="en-US" w:eastAsia="zh-CN" w:bidi="ar-SA"/>
+              </w:rPr>
+              <w:t>方法</w:t>
+            </w:r>
+          </w:p>
+        </w:tc>
+        <w:tc>
+          <w:tcPr>
+            <w:tcW w:w="0" w:type="auto"/>
+            <w:shd w:val="clear" w:color="auto" w:fill="auto"/>
+            <w:vAlign w:val="center"/>
+          </w:tcPr>
+          <w:p>
+            <w:pPr>
+              <w:pStyle w:val="13"/>
+              <w:bidi w:val="0"/>
+              <w:jc w:val="both"/>
+              <w:rPr>
+                <w:rFonts w:hint="default"/>
+                <w:lang w:val="en-US" w:eastAsia="zh-CN"/>
+              </w:rPr>
+            </w:pPr>
+            <w:r>
+              <w:rPr>
+                <w:rFonts w:hint="eastAsia"/>
+                <w:lang w:val="en-US" w:eastAsia="zh-CN"/>
+              </w:rPr>
+              <w:t>rotate(R)</w:t>
+            </w:r>
+          </w:p>
+        </w:tc>
+        <w:tc>
+          <w:tcPr>
+            <w:tcW w:w="0" w:type="auto"/>
+            <w:shd w:val="clear" w:color="auto" w:fill="auto"/>
+            <w:vAlign w:val="center"/>
+          </w:tcPr>
+          <w:p>
+            <w:pPr>
+              <w:pStyle w:val="12"/>
+              <w:bidi w:val="0"/>
+              <w:jc w:val="both"/>
+              <w:rPr>
+                <w:rFonts w:hint="default"/>
+                <w:lang w:val="en-US" w:eastAsia="zh-CN"/>
+              </w:rPr>
+            </w:pPr>
+            <w:r>
+              <w:rPr>
+                <w:rFonts w:hint="eastAsia"/>
+                <w:lang w:val="en-US" w:eastAsia="zh-CN"/>
+              </w:rPr>
+              <w:t>旋转</w:t>
             </w:r>
           </w:p>
         </w:tc>
@@ -6419,7 +6495,7 @@
         <w:tc>
           <w:tcPr>
             <w:tcW w:w="0" w:type="auto"/>
-            <w:vMerge w:val="restart"/>
+            <w:vMerge w:val="continue"/>
             <w:vAlign w:val="center"/>
           </w:tcPr>
           <w:p>
@@ -6438,32 +6514,6 @@
                 <w:lang w:val="en-US" w:eastAsia="zh-CN" w:bidi="ar-SA"/>
               </w:rPr>
             </w:pPr>
-            <w:r>
-              <w:rPr>
-                <w:rFonts w:hint="eastAsia" w:ascii="华文中宋" w:hAnsi="华文中宋" w:eastAsia="华文中宋" w:cs="华文中宋"/>
-                <w:b/>
-                <w:bCs/>
-                <w:color w:val="ED7D31"/>
-                <w:kern w:val="2"/>
-                <w:sz w:val="21"/>
-                <w:szCs w:val="21"/>
-                <w:lang w:val="en-US" w:eastAsia="zh-CN" w:bidi="ar-SA"/>
-              </w:rPr>
-              <w:t>实例</w:t>
-            </w:r>
-            <w:r>
-              <w:rPr>
-                <w:rFonts w:hint="eastAsia" w:cs="华文中宋"/>
-                <w:b/>
-                <w:bCs/>
-                <w:color w:val="ED7D31"/>
-                <w:kern w:val="2"/>
-                <w:sz w:val="21"/>
-                <w:szCs w:val="21"/>
-                <w:lang w:val="en-US" w:eastAsia="zh-CN" w:bidi="ar-SA"/>
-              </w:rPr>
-              <w:t>方法</w:t>
-            </w:r>
           </w:p>
         </w:tc>
         <w:tc>
@@ -6487,7 +6537,7 @@
                 <w:rFonts w:hint="eastAsia"/>
                 <w:lang w:val="en-US" w:eastAsia="zh-CN"/>
               </w:rPr>
-              <w:t>rotate(R)</w:t>
+              <w:t>scale(s, center)</w:t>
             </w:r>
           </w:p>
         </w:tc>
@@ -6512,7 +6562,7 @@
                 <w:rFonts w:hint="eastAsia"/>
                 <w:lang w:val="en-US" w:eastAsia="zh-CN"/>
               </w:rPr>
-              <w:t>旋转</w:t>
+              <w:t>缩放</w:t>
             </w:r>
           </w:p>
         </w:tc>
@@ -6579,7 +6629,7 @@
                 <w:rFonts w:hint="eastAsia"/>
                 <w:lang w:val="en-US" w:eastAsia="zh-CN"/>
               </w:rPr>
-              <w:t>scale(s, center)</w:t>
+              <w:t>translate(vec, relative=True)</w:t>
             </w:r>
           </w:p>
         </w:tc>
@@ -6604,7 +6654,7 @@
                 <w:rFonts w:hint="eastAsia"/>
                 <w:lang w:val="en-US" w:eastAsia="zh-CN"/>
               </w:rPr>
-              <w:t>缩放</w:t>
+              <w:t>平移</w:t>
             </w:r>
           </w:p>
         </w:tc>
@@ -6671,7 +6721,7 @@
                 <w:rFonts w:hint="eastAsia"/>
                 <w:lang w:val="en-US" w:eastAsia="zh-CN"/>
               </w:rPr>
-              <w:t>translate(vec, relative=True)</w:t>
+              <w:t>transform(T)</w:t>
             </w:r>
           </w:p>
         </w:tc>
@@ -6696,7 +6746,7 @@
                 <w:rFonts w:hint="eastAsia"/>
                 <w:lang w:val="en-US" w:eastAsia="zh-CN"/>
               </w:rPr>
-              <w:t>平移</w:t>
+              <w:t>齐次变换</w:t>
             </w:r>
           </w:p>
         </w:tc>
@@ -6711,104 +6761,6 @@
             <w:insideH w:val="single" w:color="auto" w:sz="4" w:space="0"/>
             <w:insideV w:val="single" w:color="auto" w:sz="4" w:space="0"/>
           </w:tblBorders>
-          <w:tblCellMar>
-            <w:top w:w="0" w:type="dxa"/>
-            <w:left w:w="108" w:type="dxa"/>
-            <w:bottom w:w="0" w:type="dxa"/>
-            <w:right w:w="108" w:type="dxa"/>
-          </w:tblCellMar>
-        </w:tblPrEx>
-        <w:tc>
-          <w:tcPr>
-            <w:tcW w:w="0" w:type="auto"/>
-            <w:vMerge w:val="continue"/>
-            <w:vAlign w:val="center"/>
-          </w:tcPr>
-          <w:p>
-            <w:pPr>
-              <w:pStyle w:val="13"/>
-              <w:bidi w:val="0"/>
-              <w:jc w:val="both"/>
-              <w:rPr>
-                <w:rFonts w:hint="eastAsia" w:ascii="华文中宋" w:hAnsi="华文中宋" w:eastAsia="华文中宋" w:cs="华文中宋"/>
-                <w:b/>
-                <w:bCs/>
-                <w:color w:val="ED7D31"/>
-                <w:kern w:val="2"/>
-                <w:sz w:val="21"/>
-                <w:szCs w:val="21"/>
-                <w:lang w:val="en-US" w:eastAsia="zh-CN" w:bidi="ar-SA"/>
-              </w:rPr>
-            </w:pPr>
-          </w:p>
-        </w:tc>
-        <w:tc>
-          <w:tcPr>
-            <w:tcW w:w="0" w:type="auto"/>
-            <w:shd w:val="clear" w:color="auto" w:fill="auto"/>
-            <w:vAlign w:val="center"/>
-          </w:tcPr>
-          <w:p>
-            <w:pPr>
-              <w:pStyle w:val="13"/>
-              <w:bidi w:val="0"/>
-              <w:jc w:val="both"/>
-              <w:rPr>
-                <w:rFonts w:hint="default"/>
-                <w:lang w:val="en-US" w:eastAsia="zh-CN"/>
-              </w:rPr>
-            </w:pPr>
-            <w:r>
-              <w:rPr>
-                <w:rFonts w:hint="eastAsia"/>
-                <w:lang w:val="en-US" w:eastAsia="zh-CN"/>
-              </w:rPr>
-              <w:t>transform(T)</w:t>
-            </w:r>
-          </w:p>
-        </w:tc>
-        <w:tc>
-          <w:tcPr>
-            <w:tcW w:w="0" w:type="auto"/>
-            <w:shd w:val="clear" w:color="auto" w:fill="auto"/>
-            <w:vAlign w:val="center"/>
-          </w:tcPr>
-          <w:p>
-            <w:pPr>
-              <w:pStyle w:val="12"/>
-              <w:bidi w:val="0"/>
-              <w:jc w:val="both"/>
-              <w:rPr>
-                <w:rFonts w:hint="default"/>
-                <w:lang w:val="en-US" w:eastAsia="zh-CN"/>
-              </w:rPr>
-            </w:pPr>
-            <w:r>
-              <w:rPr>
-                <w:rFonts w:hint="eastAsia"/>
-                <w:lang w:val="en-US" w:eastAsia="zh-CN"/>
-              </w:rPr>
-              <w:t>齐次变换</w:t>
-            </w:r>
-          </w:p>
-        </w:tc>
-      </w:tr>
-      <w:tr>
-        <w:tblPrEx>
-          <w:tblBorders>
-            <w:top w:val="single" w:color="auto" w:sz="4" w:space="0"/>
-            <w:left w:val="single" w:color="auto" w:sz="4" w:space="0"/>
-            <w:bottom w:val="single" w:color="auto" w:sz="4" w:space="0"/>
-            <w:right w:val="single" w:color="auto" w:sz="4" w:space="0"/>
-            <w:insideH w:val="single" w:color="auto" w:sz="4" w:space="0"/>
-            <w:insideV w:val="single" w:color="auto" w:sz="4" w:space="0"/>
-          </w:tblBorders>
-          <w:tblCellMar>
-            <w:top w:w="0" w:type="dxa"/>
-            <w:left w:w="108" w:type="dxa"/>
-            <w:bottom w:w="0" w:type="dxa"/>
-            <w:right w:w="108" w:type="dxa"/>
-          </w:tblCellMar>
         </w:tblPrEx>
         <w:tc>
           <w:tcPr>
@@ -6944,12 +6896,6 @@
             <w:insideH w:val="single" w:color="auto" w:sz="4" w:space="0"/>
             <w:insideV w:val="single" w:color="auto" w:sz="4" w:space="0"/>
           </w:tblBorders>
-          <w:tblCellMar>
-            <w:top w:w="0" w:type="dxa"/>
-            <w:left w:w="108" w:type="dxa"/>
-            <w:bottom w:w="0" w:type="dxa"/>
-            <w:right w:w="108" w:type="dxa"/>
-          </w:tblCellMar>
         </w:tblPrEx>
         <w:tc>
           <w:tcPr>
@@ -7008,12 +6954,6 @@
             <w:insideH w:val="single" w:color="auto" w:sz="4" w:space="0"/>
             <w:insideV w:val="single" w:color="auto" w:sz="4" w:space="0"/>
           </w:tblBorders>
-          <w:tblCellMar>
-            <w:top w:w="0" w:type="dxa"/>
-            <w:left w:w="108" w:type="dxa"/>
-            <w:bottom w:w="0" w:type="dxa"/>
-            <w:right w:w="108" w:type="dxa"/>
-          </w:tblCellMar>
         </w:tblPrEx>
         <w:tc>
           <w:tcPr>
@@ -8152,6 +8092,417 @@
       </w:tblPr>
       <w:tblGrid>
         <w:gridCol w:w="1057"/>
+        <w:gridCol w:w="5056"/>
+        <w:gridCol w:w="1057"/>
+      </w:tblGrid>
+      <w:tr>
+        <w:tblPrEx>
+          <w:tblBorders>
+            <w:top w:val="single" w:color="auto" w:sz="4" w:space="0"/>
+            <w:left w:val="single" w:color="auto" w:sz="4" w:space="0"/>
+            <w:bottom w:val="single" w:color="auto" w:sz="4" w:space="0"/>
+            <w:right w:val="single" w:color="auto" w:sz="4" w:space="0"/>
+            <w:insideH w:val="single" w:color="auto" w:sz="4" w:space="0"/>
+            <w:insideV w:val="single" w:color="auto" w:sz="4" w:space="0"/>
+          </w:tblBorders>
+          <w:tblCellMar>
+            <w:top w:w="0" w:type="dxa"/>
+            <w:left w:w="108" w:type="dxa"/>
+            <w:bottom w:w="0" w:type="dxa"/>
+            <w:right w:w="108" w:type="dxa"/>
+          </w:tblCellMar>
+        </w:tblPrEx>
+        <w:tc>
+          <w:tcPr>
+            <w:tcW w:w="0" w:type="auto"/>
+            <w:gridSpan w:val="2"/>
+            <w:vAlign w:val="center"/>
+          </w:tcPr>
+          <w:p>
+            <w:pPr>
+              <w:pStyle w:val="13"/>
+              <w:bidi w:val="0"/>
+              <w:jc w:val="both"/>
+              <w:rPr>
+                <w:rFonts w:hint="default"/>
+                <w:lang w:val="en-US" w:eastAsia="zh-CN"/>
+              </w:rPr>
+            </w:pPr>
+            <w:r>
+              <w:rPr>
+                <w:rFonts w:hint="eastAsia"/>
+                <w:lang w:val="en-US" w:eastAsia="zh-CN"/>
+              </w:rPr>
+              <w:t>OrientedBoundingBox(center, R, extent)</w:t>
+            </w:r>
+          </w:p>
+        </w:tc>
+        <w:tc>
+          <w:tcPr>
+            <w:tcW w:w="0" w:type="auto"/>
+            <w:vAlign w:val="center"/>
+          </w:tcPr>
+          <w:p>
+            <w:pPr>
+              <w:pStyle w:val="12"/>
+              <w:bidi w:val="0"/>
+              <w:jc w:val="both"/>
+              <w:rPr>
+                <w:rFonts w:hint="default"/>
+                <w:vertAlign w:val="baseline"/>
+                <w:lang w:val="en-US" w:eastAsia="zh-CN"/>
+              </w:rPr>
+            </w:pPr>
+            <w:r>
+              <w:rPr>
+                <w:rFonts w:hint="eastAsia"/>
+                <w:vertAlign w:val="baseline"/>
+                <w:lang w:val="en-US" w:eastAsia="zh-CN"/>
+              </w:rPr>
+              <w:t>边界框</w:t>
+            </w:r>
+          </w:p>
+        </w:tc>
+      </w:tr>
+      <w:tr>
+        <w:tblPrEx>
+          <w:tblBorders>
+            <w:top w:val="single" w:color="auto" w:sz="4" w:space="0"/>
+            <w:left w:val="single" w:color="auto" w:sz="4" w:space="0"/>
+            <w:bottom w:val="single" w:color="auto" w:sz="4" w:space="0"/>
+            <w:right w:val="single" w:color="auto" w:sz="4" w:space="0"/>
+            <w:insideH w:val="single" w:color="auto" w:sz="4" w:space="0"/>
+            <w:insideV w:val="single" w:color="auto" w:sz="4" w:space="0"/>
+          </w:tblBorders>
+        </w:tblPrEx>
+        <w:tc>
+          <w:tcPr>
+            <w:tcW w:w="0" w:type="auto"/>
+            <w:vMerge w:val="restart"/>
+            <w:vAlign w:val="center"/>
+          </w:tcPr>
+          <w:p>
+            <w:pPr>
+              <w:pStyle w:val="13"/>
+              <w:bidi w:val="0"/>
+              <w:jc w:val="both"/>
+              <w:rPr>
+                <w:rFonts w:hint="default"/>
+                <w:lang w:val="en-US" w:eastAsia="zh-CN"/>
+              </w:rPr>
+            </w:pPr>
+            <w:r>
+              <w:rPr>
+                <w:rFonts w:hint="eastAsia" w:ascii="华文中宋" w:hAnsi="华文中宋" w:eastAsia="华文中宋" w:cs="华文中宋"/>
+                <w:b/>
+                <w:bCs/>
+                <w:color w:val="ED7D31"/>
+                <w:kern w:val="2"/>
+                <w:sz w:val="21"/>
+                <w:szCs w:val="21"/>
+                <w:lang w:val="en-US" w:eastAsia="zh-CN" w:bidi="ar-SA"/>
+              </w:rPr>
+              <w:t>实例属性</w:t>
+            </w:r>
+          </w:p>
+        </w:tc>
+        <w:tc>
+          <w:tcPr>
+            <w:tcW w:w="0" w:type="auto"/>
+            <w:vAlign w:val="center"/>
+          </w:tcPr>
+          <w:p>
+            <w:pPr>
+              <w:pStyle w:val="13"/>
+              <w:bidi w:val="0"/>
+              <w:jc w:val="both"/>
+              <w:rPr>
+                <w:rFonts w:hint="default"/>
+                <w:lang w:val="en-US" w:eastAsia="zh-CN"/>
+              </w:rPr>
+            </w:pPr>
+            <w:r>
+              <w:rPr>
+                <w:rFonts w:hint="eastAsia"/>
+                <w:lang w:val="en-US" w:eastAsia="zh-CN"/>
+              </w:rPr>
+              <w:t>volu</w:t>
+            </w:r>
+            <w:bookmarkStart w:id="0" w:name="_GoBack"/>
+            <w:bookmarkEnd w:id="0"/>
+            <w:r>
+              <w:rPr>
+                <w:rFonts w:hint="eastAsia"/>
+                <w:lang w:val="en-US" w:eastAsia="zh-CN"/>
+              </w:rPr>
+              <w:t>me()</w:t>
+            </w:r>
+          </w:p>
+        </w:tc>
+        <w:tc>
+          <w:tcPr>
+            <w:tcW w:w="0" w:type="auto"/>
+            <w:vAlign w:val="center"/>
+          </w:tcPr>
+          <w:p>
+            <w:pPr>
+              <w:pStyle w:val="12"/>
+              <w:bidi w:val="0"/>
+              <w:jc w:val="both"/>
+              <w:rPr>
+                <w:rFonts w:hint="eastAsia"/>
+                <w:lang w:val="en-US" w:eastAsia="zh-CN"/>
+              </w:rPr>
+            </w:pPr>
+            <w:r>
+              <w:rPr>
+                <w:rFonts w:hint="eastAsia"/>
+                <w:lang w:val="en-US" w:eastAsia="zh-CN"/>
+              </w:rPr>
+              <w:t>体积</w:t>
+            </w:r>
+          </w:p>
+        </w:tc>
+      </w:tr>
+      <w:tr>
+        <w:tblPrEx>
+          <w:tblBorders>
+            <w:top w:val="single" w:color="auto" w:sz="4" w:space="0"/>
+            <w:left w:val="single" w:color="auto" w:sz="4" w:space="0"/>
+            <w:bottom w:val="single" w:color="auto" w:sz="4" w:space="0"/>
+            <w:right w:val="single" w:color="auto" w:sz="4" w:space="0"/>
+            <w:insideH w:val="single" w:color="auto" w:sz="4" w:space="0"/>
+            <w:insideV w:val="single" w:color="auto" w:sz="4" w:space="0"/>
+          </w:tblBorders>
+          <w:tblCellMar>
+            <w:top w:w="0" w:type="dxa"/>
+            <w:left w:w="108" w:type="dxa"/>
+            <w:bottom w:w="0" w:type="dxa"/>
+            <w:right w:w="108" w:type="dxa"/>
+          </w:tblCellMar>
+        </w:tblPrEx>
+        <w:tc>
+          <w:tcPr>
+            <w:tcW w:w="0" w:type="auto"/>
+            <w:vMerge w:val="continue"/>
+            <w:tcBorders/>
+            <w:vAlign w:val="center"/>
+          </w:tcPr>
+          <w:p>
+            <w:pPr>
+              <w:pStyle w:val="13"/>
+              <w:bidi w:val="0"/>
+              <w:jc w:val="both"/>
+              <w:rPr>
+                <w:rFonts w:hint="default"/>
+                <w:lang w:val="en-US" w:eastAsia="zh-CN"/>
+              </w:rPr>
+            </w:pPr>
+          </w:p>
+        </w:tc>
+        <w:tc>
+          <w:tcPr>
+            <w:tcW w:w="0" w:type="auto"/>
+            <w:vAlign w:val="center"/>
+          </w:tcPr>
+          <w:p>
+            <w:pPr>
+              <w:pStyle w:val="13"/>
+              <w:bidi w:val="0"/>
+              <w:jc w:val="both"/>
+              <w:rPr>
+                <w:rFonts w:hint="default"/>
+                <w:lang w:val="en-US" w:eastAsia="zh-CN"/>
+              </w:rPr>
+            </w:pPr>
+            <w:r>
+              <w:rPr>
+                <w:rFonts w:hint="eastAsia"/>
+                <w:lang w:val="en-US" w:eastAsia="zh-CN"/>
+              </w:rPr>
+              <w:t>get_box_points()</w:t>
+            </w:r>
+          </w:p>
+        </w:tc>
+        <w:tc>
+          <w:tcPr>
+            <w:tcW w:w="0" w:type="auto"/>
+            <w:vAlign w:val="center"/>
+          </w:tcPr>
+          <w:p>
+            <w:pPr>
+              <w:pStyle w:val="12"/>
+              <w:bidi w:val="0"/>
+              <w:jc w:val="both"/>
+              <w:rPr>
+                <w:rFonts w:hint="default"/>
+                <w:lang w:val="en-US" w:eastAsia="zh-CN"/>
+              </w:rPr>
+            </w:pPr>
+            <w:r>
+              <w:rPr>
+                <w:rFonts w:hint="eastAsia"/>
+                <w:lang w:val="en-US" w:eastAsia="zh-CN"/>
+              </w:rPr>
+              <w:t>角点</w:t>
+            </w:r>
+          </w:p>
+        </w:tc>
+      </w:tr>
+      <w:tr>
+        <w:tblPrEx>
+          <w:tblBorders>
+            <w:top w:val="single" w:color="auto" w:sz="4" w:space="0"/>
+            <w:left w:val="single" w:color="auto" w:sz="4" w:space="0"/>
+            <w:bottom w:val="single" w:color="auto" w:sz="4" w:space="0"/>
+            <w:right w:val="single" w:color="auto" w:sz="4" w:space="0"/>
+            <w:insideH w:val="single" w:color="auto" w:sz="4" w:space="0"/>
+            <w:insideV w:val="single" w:color="auto" w:sz="4" w:space="0"/>
+          </w:tblBorders>
+          <w:tblCellMar>
+            <w:top w:w="0" w:type="dxa"/>
+            <w:left w:w="108" w:type="dxa"/>
+            <w:bottom w:w="0" w:type="dxa"/>
+            <w:right w:w="108" w:type="dxa"/>
+          </w:tblCellMar>
+        </w:tblPrEx>
+        <w:tc>
+          <w:tcPr>
+            <w:tcW w:w="0" w:type="auto"/>
+            <w:vAlign w:val="center"/>
+          </w:tcPr>
+          <w:p>
+            <w:pPr>
+              <w:pStyle w:val="13"/>
+              <w:bidi w:val="0"/>
+              <w:jc w:val="both"/>
+              <w:rPr>
+                <w:rFonts w:hint="eastAsia" w:cs="华文中宋"/>
+                <w:b/>
+                <w:bCs/>
+                <w:color w:val="ED7D31"/>
+                <w:kern w:val="2"/>
+                <w:sz w:val="21"/>
+                <w:szCs w:val="21"/>
+                <w:lang w:val="en-US" w:eastAsia="zh-CN" w:bidi="ar-SA"/>
+              </w:rPr>
+            </w:pPr>
+            <w:r>
+              <w:rPr>
+                <w:rFonts w:hint="eastAsia" w:cs="华文中宋"/>
+                <w:b/>
+                <w:bCs/>
+                <w:color w:val="ED7D31"/>
+                <w:kern w:val="2"/>
+                <w:sz w:val="21"/>
+                <w:szCs w:val="21"/>
+                <w:lang w:val="en-US" w:eastAsia="zh-CN" w:bidi="ar-SA"/>
+              </w:rPr>
+              <w:t>实例</w:t>
+            </w:r>
+            <w:r>
+              <w:rPr>
+                <w:rFonts w:hint="eastAsia" w:ascii="华文中宋" w:hAnsi="华文中宋" w:eastAsia="华文中宋" w:cs="华文中宋"/>
+                <w:b/>
+                <w:bCs/>
+                <w:color w:val="ED7D31"/>
+                <w:kern w:val="2"/>
+                <w:sz w:val="21"/>
+                <w:szCs w:val="21"/>
+                <w:lang w:val="en-US" w:eastAsia="zh-CN" w:bidi="ar-SA"/>
+              </w:rPr>
+              <w:t>方法</w:t>
+            </w:r>
+          </w:p>
+        </w:tc>
+        <w:tc>
+          <w:tcPr>
+            <w:tcW w:w="0" w:type="auto"/>
+            <w:vAlign w:val="center"/>
+          </w:tcPr>
+          <w:p>
+            <w:pPr>
+              <w:pStyle w:val="13"/>
+              <w:bidi w:val="0"/>
+              <w:jc w:val="both"/>
+              <w:rPr>
+                <w:rFonts w:hint="default"/>
+                <w:lang w:val="en-US" w:eastAsia="zh-CN"/>
+              </w:rPr>
+            </w:pPr>
+            <w:r>
+              <w:rPr>
+                <w:rFonts w:hint="default"/>
+                <w:lang w:val="en-US" w:eastAsia="zh-CN"/>
+              </w:rPr>
+              <w:t>get_point_indices_within_bounding_box</w:t>
+            </w:r>
+            <w:r>
+              <w:rPr>
+                <w:rFonts w:hint="eastAsia"/>
+                <w:lang w:val="en-US" w:eastAsia="zh-CN"/>
+              </w:rPr>
+              <w:t>(points)</w:t>
+            </w:r>
+          </w:p>
+        </w:tc>
+        <w:tc>
+          <w:tcPr>
+            <w:tcW w:w="0" w:type="auto"/>
+            <w:vAlign w:val="center"/>
+          </w:tcPr>
+          <w:p>
+            <w:pPr>
+              <w:pStyle w:val="12"/>
+              <w:bidi w:val="0"/>
+              <w:jc w:val="both"/>
+              <w:rPr>
+                <w:rFonts w:hint="eastAsia"/>
+                <w:lang w:val="en-US" w:eastAsia="zh-CN"/>
+              </w:rPr>
+            </w:pPr>
+            <w:r>
+              <w:rPr>
+                <w:rFonts w:hint="eastAsia"/>
+                <w:lang w:val="en-US" w:eastAsia="zh-CN"/>
+              </w:rPr>
+              <w:t>包含判断</w:t>
+            </w:r>
+          </w:p>
+        </w:tc>
+      </w:tr>
+    </w:tbl>
+    <w:p>
+      <w:pPr>
+        <w:rPr>
+          <w:rFonts w:hint="default"/>
+          <w:lang w:val="en-US" w:eastAsia="zh-CN"/>
+        </w:rPr>
+      </w:pPr>
+    </w:p>
+    <w:tbl>
+      <w:tblPr>
+        <w:tblStyle w:val="8"/>
+        <w:tblW w:w="0" w:type="auto"/>
+        <w:tblInd w:w="0" w:type="dxa"/>
+        <w:tblBorders>
+          <w:top w:val="single" w:color="auto" w:sz="4" w:space="0"/>
+          <w:left w:val="single" w:color="auto" w:sz="4" w:space="0"/>
+          <w:bottom w:val="single" w:color="auto" w:sz="4" w:space="0"/>
+          <w:right w:val="single" w:color="auto" w:sz="4" w:space="0"/>
+          <w:insideH w:val="single" w:color="auto" w:sz="4" w:space="0"/>
+          <w:insideV w:val="single" w:color="auto" w:sz="4" w:space="0"/>
+        </w:tblBorders>
+        <w:tblLayout w:type="autofit"/>
+        <w:tblCellMar>
+          <w:top w:w="0" w:type="dxa"/>
+          <w:left w:w="108" w:type="dxa"/>
+          <w:bottom w:w="0" w:type="dxa"/>
+          <w:right w:w="108" w:type="dxa"/>
+        </w:tblCellMar>
+      </w:tblPr>
+      <w:tblGrid>
+        <w:gridCol w:w="1057"/>
         <w:gridCol w:w="4879"/>
         <w:gridCol w:w="1688"/>
       </w:tblGrid>
@@ -8350,12 +8701,6 @@
             <w:insideH w:val="single" w:color="auto" w:sz="4" w:space="0"/>
             <w:insideV w:val="single" w:color="auto" w:sz="4" w:space="0"/>
           </w:tblBorders>
-          <w:tblCellMar>
-            <w:top w:w="0" w:type="dxa"/>
-            <w:left w:w="108" w:type="dxa"/>
-            <w:bottom w:w="0" w:type="dxa"/>
-            <w:right w:w="108" w:type="dxa"/>
-          </w:tblCellMar>
         </w:tblPrEx>
         <w:tc>
           <w:tcPr>
@@ -8738,12 +9083,6 @@
             <w:insideH w:val="single" w:color="auto" w:sz="4" w:space="0"/>
             <w:insideV w:val="single" w:color="auto" w:sz="4" w:space="0"/>
           </w:tblBorders>
-          <w:tblCellMar>
-            <w:top w:w="0" w:type="dxa"/>
-            <w:left w:w="108" w:type="dxa"/>
-            <w:bottom w:w="0" w:type="dxa"/>
-            <w:right w:w="108" w:type="dxa"/>
-          </w:tblCellMar>
         </w:tblPrEx>
         <w:tc>
           <w:tcPr>
@@ -8939,12 +9278,6 @@
             <w:insideH w:val="single" w:color="auto" w:sz="4" w:space="0"/>
             <w:insideV w:val="single" w:color="auto" w:sz="4" w:space="0"/>
           </w:tblBorders>
-          <w:tblCellMar>
-            <w:top w:w="0" w:type="dxa"/>
-            <w:left w:w="108" w:type="dxa"/>
-            <w:bottom w:w="0" w:type="dxa"/>
-            <w:right w:w="108" w:type="dxa"/>
-          </w:tblCellMar>
         </w:tblPrEx>
         <w:tc>
           <w:tcPr>
@@ -9007,12 +9340,6 @@
             <w:insideH w:val="single" w:color="auto" w:sz="4" w:space="0"/>
             <w:insideV w:val="single" w:color="auto" w:sz="4" w:space="0"/>
           </w:tblBorders>
-          <w:tblCellMar>
-            <w:top w:w="0" w:type="dxa"/>
-            <w:left w:w="108" w:type="dxa"/>
-            <w:bottom w:w="0" w:type="dxa"/>
-            <w:right w:w="108" w:type="dxa"/>
-          </w:tblCellMar>
         </w:tblPrEx>
         <w:tc>
           <w:tcPr>
@@ -9118,12 +9445,6 @@
             <w:insideH w:val="single" w:color="auto" w:sz="4" w:space="0"/>
             <w:insideV w:val="single" w:color="auto" w:sz="4" w:space="0"/>
           </w:tblBorders>
-          <w:tblCellMar>
-            <w:top w:w="0" w:type="dxa"/>
-            <w:left w:w="108" w:type="dxa"/>
-            <w:bottom w:w="0" w:type="dxa"/>
-            <w:right w:w="108" w:type="dxa"/>
-          </w:tblCellMar>
         </w:tblPrEx>
         <w:tc>
           <w:tcPr>
@@ -9229,12 +9550,6 @@
             <w:insideH w:val="single" w:color="auto" w:sz="4" w:space="0"/>
             <w:insideV w:val="single" w:color="auto" w:sz="4" w:space="0"/>
           </w:tblBorders>
-          <w:tblCellMar>
-            <w:top w:w="0" w:type="dxa"/>
-            <w:left w:w="108" w:type="dxa"/>
-            <w:bottom w:w="0" w:type="dxa"/>
-            <w:right w:w="108" w:type="dxa"/>
-          </w:tblCellMar>
         </w:tblPrEx>
         <w:tc>
           <w:tcPr>
@@ -9341,12 +9656,6 @@
             <w:insideH w:val="single" w:color="auto" w:sz="4" w:space="0"/>
             <w:insideV w:val="single" w:color="auto" w:sz="4" w:space="0"/>
           </w:tblBorders>
-          <w:tblCellMar>
-            <w:top w:w="0" w:type="dxa"/>
-            <w:left w:w="108" w:type="dxa"/>
-            <w:bottom w:w="0" w:type="dxa"/>
-            <w:right w:w="108" w:type="dxa"/>
-          </w:tblCellMar>
         </w:tblPrEx>
         <w:tc>
           <w:tcPr>
@@ -9459,12 +9768,6 @@
             <w:insideH w:val="single" w:color="auto" w:sz="4" w:space="0"/>
             <w:insideV w:val="single" w:color="auto" w:sz="4" w:space="0"/>
           </w:tblBorders>
-          <w:tblCellMar>
-            <w:top w:w="0" w:type="dxa"/>
-            <w:left w:w="108" w:type="dxa"/>
-            <w:bottom w:w="0" w:type="dxa"/>
-            <w:right w:w="108" w:type="dxa"/>
-          </w:tblCellMar>
         </w:tblPrEx>
         <w:tc>
           <w:tcPr>
@@ -10291,12 +10594,6 @@
             <w:insideH w:val="single" w:color="auto" w:sz="4" w:space="0"/>
             <w:insideV w:val="single" w:color="auto" w:sz="4" w:space="0"/>
           </w:tblBorders>
-          <w:tblCellMar>
-            <w:top w:w="0" w:type="dxa"/>
-            <w:left w:w="108" w:type="dxa"/>
-            <w:bottom w:w="0" w:type="dxa"/>
-            <w:right w:w="108" w:type="dxa"/>
-          </w:tblCellMar>
         </w:tblPrEx>
         <w:tc>
           <w:tcPr>
@@ -10355,12 +10652,6 @@
             <w:insideH w:val="single" w:color="auto" w:sz="4" w:space="0"/>
             <w:insideV w:val="single" w:color="auto" w:sz="4" w:space="0"/>
           </w:tblBorders>
-          <w:tblCellMar>
-            <w:top w:w="0" w:type="dxa"/>
-            <w:left w:w="108" w:type="dxa"/>
-            <w:bottom w:w="0" w:type="dxa"/>
-            <w:right w:w="108" w:type="dxa"/>
-          </w:tblCellMar>
         </w:tblPrEx>
         <w:tc>
           <w:tcPr>
@@ -10814,12 +11105,6 @@
             <w:insideH w:val="single" w:color="auto" w:sz="4" w:space="0"/>
             <w:insideV w:val="single" w:color="auto" w:sz="4" w:space="0"/>
           </w:tblBorders>
-          <w:tblCellMar>
-            <w:top w:w="0" w:type="dxa"/>
-            <w:left w:w="108" w:type="dxa"/>
-            <w:bottom w:w="0" w:type="dxa"/>
-            <w:right w:w="108" w:type="dxa"/>
-          </w:tblCellMar>
         </w:tblPrEx>
         <w:tc>
           <w:tcPr>
@@ -11188,12 +11473,6 @@
             <w:insideH w:val="single" w:color="auto" w:sz="4" w:space="0"/>
             <w:insideV w:val="single" w:color="auto" w:sz="4" w:space="0"/>
           </w:tblBorders>
-          <w:tblCellMar>
-            <w:top w:w="0" w:type="dxa"/>
-            <w:left w:w="108" w:type="dxa"/>
-            <w:bottom w:w="0" w:type="dxa"/>
-            <w:right w:w="108" w:type="dxa"/>
-          </w:tblCellMar>
         </w:tblPrEx>
         <w:tc>
           <w:tcPr>
@@ -11740,12 +12019,6 @@
             <w:insideH w:val="single" w:color="auto" w:sz="4" w:space="0"/>
             <w:insideV w:val="single" w:color="auto" w:sz="4" w:space="0"/>
           </w:tblBorders>
-          <w:tblCellMar>
-            <w:top w:w="0" w:type="dxa"/>
-            <w:left w:w="108" w:type="dxa"/>
-            <w:bottom w:w="0" w:type="dxa"/>
-            <w:right w:w="108" w:type="dxa"/>
-          </w:tblCellMar>
         </w:tblPrEx>
         <w:tc>
           <w:tcPr>
@@ -12414,12 +12687,6 @@
             <w:insideH w:val="single" w:color="auto" w:sz="4" w:space="0"/>
             <w:insideV w:val="single" w:color="auto" w:sz="4" w:space="0"/>
           </w:tblBorders>
-          <w:tblCellMar>
-            <w:top w:w="0" w:type="dxa"/>
-            <w:left w:w="108" w:type="dxa"/>
-            <w:bottom w:w="0" w:type="dxa"/>
-            <w:right w:w="108" w:type="dxa"/>
-          </w:tblCellMar>
         </w:tblPrEx>
         <w:tc>
           <w:tcPr>
@@ -12919,12 +13186,6 @@
             <w:insideH w:val="single" w:color="auto" w:sz="4" w:space="0"/>
             <w:insideV w:val="single" w:color="auto" w:sz="4" w:space="0"/>
           </w:tblBorders>
-          <w:tblCellMar>
-            <w:top w:w="0" w:type="dxa"/>
-            <w:left w:w="108" w:type="dxa"/>
-            <w:bottom w:w="0" w:type="dxa"/>
-            <w:right w:w="108" w:type="dxa"/>
-          </w:tblCellMar>
         </w:tblPrEx>
         <w:tc>
           <w:tcPr>
@@ -13489,12 +13750,6 @@
             <w:insideH w:val="single" w:color="auto" w:sz="4" w:space="0"/>
             <w:insideV w:val="single" w:color="auto" w:sz="4" w:space="0"/>
           </w:tblBorders>
-          <w:tblCellMar>
-            <w:top w:w="0" w:type="dxa"/>
-            <w:left w:w="108" w:type="dxa"/>
-            <w:bottom w:w="0" w:type="dxa"/>
-            <w:right w:w="108" w:type="dxa"/>
-          </w:tblCellMar>
         </w:tblPrEx>
         <w:tc>
           <w:tcPr>
@@ -13913,12 +14168,6 @@
             <w:insideH w:val="single" w:color="auto" w:sz="4" w:space="0"/>
             <w:insideV w:val="single" w:color="auto" w:sz="4" w:space="0"/>
           </w:tblBorders>
-          <w:tblCellMar>
-            <w:top w:w="0" w:type="dxa"/>
-            <w:left w:w="108" w:type="dxa"/>
-            <w:bottom w:w="0" w:type="dxa"/>
-            <w:right w:w="108" w:type="dxa"/>
-          </w:tblCellMar>
         </w:tblPrEx>
         <w:tc>
           <w:tcPr>
@@ -14648,12 +14897,6 @@
             <w:insideH w:val="single" w:color="auto" w:sz="4" w:space="0"/>
             <w:insideV w:val="single" w:color="auto" w:sz="4" w:space="0"/>
           </w:tblBorders>
-          <w:tblCellMar>
-            <w:top w:w="0" w:type="dxa"/>
-            <w:left w:w="108" w:type="dxa"/>
-            <w:bottom w:w="0" w:type="dxa"/>
-            <w:right w:w="108" w:type="dxa"/>
-          </w:tblCellMar>
         </w:tblPrEx>
         <w:tc>
           <w:tcPr>
@@ -15375,12 +15618,6 @@
             <w:insideH w:val="single" w:color="auto" w:sz="4" w:space="0"/>
             <w:insideV w:val="single" w:color="auto" w:sz="4" w:space="0"/>
           </w:tblBorders>
-          <w:tblCellMar>
-            <w:top w:w="0" w:type="dxa"/>
-            <w:left w:w="108" w:type="dxa"/>
-            <w:bottom w:w="0" w:type="dxa"/>
-            <w:right w:w="108" w:type="dxa"/>
-          </w:tblCellMar>
         </w:tblPrEx>
         <w:tc>
           <w:tcPr>
@@ -15806,12 +16043,6 @@
             <w:insideH w:val="single" w:color="auto" w:sz="4" w:space="0"/>
             <w:insideV w:val="single" w:color="auto" w:sz="4" w:space="0"/>
           </w:tblBorders>
-          <w:tblCellMar>
-            <w:top w:w="0" w:type="dxa"/>
-            <w:left w:w="108" w:type="dxa"/>
-            <w:bottom w:w="0" w:type="dxa"/>
-            <w:right w:w="108" w:type="dxa"/>
-          </w:tblCellMar>
         </w:tblPrEx>
         <w:tc>
           <w:tcPr>
@@ -16117,8 +16348,6 @@
               </w:rPr>
               <w:t>保存</w:t>
             </w:r>
-            <w:bookmarkStart w:id="0" w:name="_GoBack"/>
-            <w:bookmarkEnd w:id="0"/>
           </w:p>
         </w:tc>
       </w:tr>

</xml_diff>